<commit_message>
Proposition : budget porté à 400 000 000 GNF, construction et déploiement en un mois après la Semaine de l'Indépendance
Co-Authored-By: Claude Fable 5.1 <noreply@anthropic.com>
Claude-Session: https://claude.ai/code/session_01TG1dSSE3Ane2FLdvQ1HoL8
</commit_message>
<xml_diff>
--- a/proposition/Proposition Government Quiz Guinee - Plateforme nationale de quiz educatifs.docx
+++ b/proposition/Proposition Government Quiz Guinee - Plateforme nationale de quiz educatifs.docx
@@ -258,7 +258,7 @@
                 <w:color w:val="2A6396"/>
                 <w:sz w:val="32"/>
               </w:rPr>
-              <w:t>370 000 000 GNF</w:t>
+              <w:t>400 000 000 GNF</w:t>
             </w:r>
           </w:p>
         </w:tc>
@@ -650,7 +650,7 @@
                 <w:color w:val="121826"/>
                 <w:sz w:val="19"/>
               </w:rPr>
-              <w:t>370 000 000 GNF (environ 42 100 USD) pour la construction et 12 mois d'exploitation</w:t>
+              <w:t>400 000 000 GNF (environ 45 600 USD) pour la construction et 12 mois d'exploitation</w:t>
             </w:r>
           </w:p>
         </w:tc>
@@ -719,6 +719,51 @@
                 <w:color w:val="2A6396"/>
                 <w:sz w:val="18"/>
               </w:rPr>
+              <w:t>Délai de réalisation</w:t>
+            </w:r>
+          </w:p>
+        </w:tc>
+        <w:tc>
+          <w:tcPr>
+            <w:tcW w:type="dxa" w:w="7030"/>
+          </w:tcPr>
+          <w:p>
+            <w:pPr>
+              <w:spacing w:before="60" w:after="60"/>
+            </w:pPr>
+            <w:r>
+              <w:rPr>
+                <w:rFonts w:ascii="Century Gothic" w:hAnsi="Century Gothic" w:eastAsia="Century Gothic"/>
+                <w:b w:val="0"/>
+                <w:i w:val="0"/>
+                <w:caps w:val="0"/>
+                <w:color w:val="121826"/>
+                <w:sz w:val="19"/>
+              </w:rPr>
+              <w:t>Un mois : la plateforme complète est construite, testée et déployée dans les trente jours qui suivent la fin de la Semaine de l'Indépendance</w:t>
+            </w:r>
+          </w:p>
+        </w:tc>
+      </w:tr>
+      <w:tr>
+        <w:tc>
+          <w:tcPr>
+            <w:tcW w:type="dxa" w:w="2608"/>
+            <w:shd w:val="clear" w:color="auto" w:fill="EDF3F8"/>
+          </w:tcPr>
+          <w:p>
+            <w:pPr>
+              <w:spacing w:before="60" w:after="60"/>
+            </w:pPr>
+            <w:r>
+              <w:rPr>
+                <w:rFonts w:ascii="Century Gothic" w:hAnsi="Century Gothic" w:eastAsia="Century Gothic"/>
+                <w:b/>
+                <w:i w:val="0"/>
+                <w:caps w:val="0"/>
+                <w:color w:val="2A6396"/>
+                <w:sz w:val="18"/>
+              </w:rPr>
               <w:t>Calendrier</w:t>
             </w:r>
           </w:p>
@@ -740,7 +785,7 @@
                 <w:color w:val="121826"/>
                 <w:sz w:val="19"/>
               </w:rPr>
-              <w:t>Décision : octobre 2026 · Construction : novembre 2026 – janvier 2027 · Lancement national : février 2027 · Cérémonie nationale du Mérite : octobre 2027 (An 69)</w:t>
+              <w:t>Décision : avant le 2 octobre 2026 · Construction et déploiement : du 3 octobre au 2 novembre 2026, soit un mois après la Semaine de l'Indépendance · Lancement national : novembre 2026 · Cérémonie nationale du Mérite : octobre 2027 (An 69)</w:t>
             </w:r>
           </w:p>
         </w:tc>
@@ -850,6 +895,23 @@
         <w:t>La présente note propose d'en faire un outil national : une plateforme où chaque ministère, chaque agence et chaque société d'État peut publier ses propres quiz en téléversant simplement un fichier de questions avec les bonnes réponses. La plateforme construit le quiz, accueille les participants, tient les classements, délivre les certificats et fournit un tableau de bord. Surtout, elle relie l'effort d'apprendre à des opportunités réelles : les meilleurs participants de chaque campagne reçoivent des bourses d'études complètes, des formations professionnelles et techniques, des stages et des emplois, offerts par les institutions et leurs partenaires.</w:t>
       </w:r>
     </w:p>
+    <w:p>
+      <w:pPr>
+        <w:spacing w:before="0" w:after="120" w:line="276" w:lineRule="auto"/>
+        <w:jc w:val="both"/>
+      </w:pPr>
+      <w:r>
+        <w:rPr>
+          <w:rFonts w:ascii="Century Gothic" w:hAnsi="Century Gothic" w:eastAsia="Century Gothic"/>
+          <w:b w:val="0"/>
+          <w:i w:val="0"/>
+          <w:caps w:val="0"/>
+          <w:color w:val="121826"/>
+          <w:sz w:val="20"/>
+        </w:rPr>
+        <w:t>Parce qu'elle s'appuie sur le socle déjà en service, la plateforme complète peut être construite, testée et déployée en un mois, dès la fin de la Semaine de l'Indépendance : décision avant le 2 octobre 2026, mise en service le 2 novembre 2026, premières campagnes des ministères en novembre.</w:t>
+      </w:r>
+    </w:p>
     <w:tbl>
       <w:tblPr>
         <w:tblW w:type="auto" w:w="0"/>
@@ -871,6 +933,46 @@
         <w:gridCol w:w="2409"/>
       </w:tblGrid>
       <w:tr>
+        <w:tc>
+          <w:tcPr>
+            <w:tcW w:type="dxa" w:w="2409"/>
+            <w:shd w:val="clear" w:color="auto" w:fill="EDF3F8"/>
+          </w:tcPr>
+          <w:p>
+            <w:pPr>
+              <w:spacing w:before="120"/>
+              <w:jc w:val="center"/>
+            </w:pPr>
+            <w:r>
+              <w:rPr>
+                <w:rFonts w:ascii="Century Gothic" w:hAnsi="Century Gothic" w:eastAsia="Century Gothic"/>
+                <w:b/>
+                <w:i w:val="0"/>
+                <w:caps w:val="0"/>
+                <w:color w:val="2A6396"/>
+                <w:sz w:val="30"/>
+              </w:rPr>
+              <w:t>1 mois</w:t>
+            </w:r>
+          </w:p>
+          <w:p>
+            <w:pPr>
+              <w:spacing w:after="120"/>
+              <w:jc w:val="center"/>
+            </w:pPr>
+            <w:r>
+              <w:rPr>
+                <w:rFonts w:ascii="Century Gothic" w:hAnsi="Century Gothic" w:eastAsia="Century Gothic"/>
+                <w:b w:val="0"/>
+                <w:i w:val="0"/>
+                <w:caps w:val="0"/>
+                <w:color w:val="7F838F"/>
+                <w:sz w:val="16"/>
+              </w:rPr>
+              <w:t>pour construire et déployer la plateforme</w:t>
+            </w:r>
+          </w:p>
+        </w:tc>
         <w:tc>
           <w:tcPr>
             <w:tcW w:type="dxa" w:w="2409"/>
@@ -970,47 +1072,7 @@
                 <w:color w:val="2A6396"/>
                 <w:sz w:val="30"/>
               </w:rPr>
-              <w:t>1 000+</w:t>
-            </w:r>
-          </w:p>
-          <w:p>
-            <w:pPr>
-              <w:spacing w:after="120"/>
-              <w:jc w:val="center"/>
-            </w:pPr>
-            <w:r>
-              <w:rPr>
-                <w:rFonts w:ascii="Century Gothic" w:hAnsi="Century Gothic" w:eastAsia="Century Gothic"/>
-                <w:b w:val="0"/>
-                <w:i w:val="0"/>
-                <w:caps w:val="0"/>
-                <w:color w:val="7F838F"/>
-                <w:sz w:val="16"/>
-              </w:rPr>
-              <w:t>jeunes récompensés en année 1</w:t>
-            </w:r>
-          </w:p>
-        </w:tc>
-        <w:tc>
-          <w:tcPr>
-            <w:tcW w:type="dxa" w:w="2409"/>
-            <w:shd w:val="clear" w:color="auto" w:fill="EDF3F8"/>
-          </w:tcPr>
-          <w:p>
-            <w:pPr>
-              <w:spacing w:before="120"/>
-              <w:jc w:val="center"/>
-            </w:pPr>
-            <w:r>
-              <w:rPr>
-                <w:rFonts w:ascii="Century Gothic" w:hAnsi="Century Gothic" w:eastAsia="Century Gothic"/>
-                <w:b/>
-                <w:i w:val="0"/>
-                <w:caps w:val="0"/>
-                <w:color w:val="2A6396"/>
-                <w:sz w:val="30"/>
-              </w:rPr>
-              <w:t>370 millions</w:t>
+              <w:t>400 millions</w:t>
             </w:r>
           </w:p>
           <w:p>
@@ -1052,7 +1114,7 @@
           <w:color w:val="121826"/>
           <w:sz w:val="20"/>
         </w:rPr>
-        <w:t>Le coût demandé, 370 000 000 GNF pour la construction et douze mois d'exploitation, représente 31 GNF par participant et par mois à pleine capacité, soit moins que le prix d'un SMS. Les récompenses elles-mêmes sont des contributions en nature des institutions et des partenaires (bourses, places de formation, stages, emplois), réunies dans un Fonds du Mérite.</w:t>
+        <w:t>Le coût demandé, 400 000 000 GNF pour la construction et douze mois d'exploitation, représente 33 GNF par participant et par mois à pleine capacité, soit moins que le prix d'un SMS. Les récompenses elles-mêmes sont des contributions en nature des institutions et des partenaires (bourses, places de formation, stages, emplois), réunies dans un Fonds du Mérite.</w:t>
       </w:r>
     </w:p>
     <w:tbl>
@@ -1116,7 +1178,7 @@
           <w:color w:val="121826"/>
           <w:sz w:val="20"/>
         </w:rPr>
-        <w:t>Le Gouvernement est invité à approuver le projet et son budget, à confier au SGG la maîtrise d'ouvrage, à instruire chaque institution de désigner un point focal et de publier au moins un quiz au cours de la première année, et à créer le Fonds du Mérite dont la remise annuelle des récompenses serait présidée par le Chef de l'État.</w:t>
+        <w:t>Le Gouvernement est invité à approuver le projet et son budget, à confier au SGG la maîtrise d'ouvrage, à instruire chaque institution de désigner un point focal sous quinze jours et de publier au moins un quiz au cours de la première année, et à créer le Fonds du Mérite dont la remise annuelle des récompenses serait présidée par le Chef de l'État.</w:t>
       </w:r>
     </w:p>
     <w:p>
@@ -3971,7 +4033,7 @@
           <w:color w:val="121826"/>
           <w:sz w:val="20"/>
         </w:rPr>
-        <w:t>Efficience : 370 000 000 GNF pour 500 000 participants représentent 740 GNF par jeune touché sur l'année, certificat et données compris ; à pleine capacité, 31 GNF par participant et par mois.</w:t>
+        <w:t>Efficience : 400 000 000 GNF pour 500 000 participants représentent 800 GNF par jeune touché sur l'année, certificat et données compris ; à pleine capacité, 33 GNF par participant et par mois.</w:t>
       </w:r>
     </w:p>
     <w:p>
@@ -4338,7 +4400,7 @@
           <w:color w:val="2A6396"/>
           <w:sz w:val="25"/>
         </w:rPr>
-        <w:t>11. FEUILLE DE ROUTE SUR DOUZE MOIS</w:t>
+        <w:t>11. FEUILLE DE ROUTE : UN MOIS POUR DÉPLOYER, DOUZE MOIS POUR INSTALLER</w:t>
       </w:r>
     </w:p>
     <w:p>
@@ -4355,7 +4417,7 @@
           <w:color w:val="121826"/>
           <w:sz w:val="20"/>
         </w:rPr>
-        <w:t>Le calendrier part du pilote de la Semaine de l'Indépendance An 68 et aboutit, un an plus tard, à la première Cérémonie nationale du Mérite lors de la Semaine de l'Indépendance An 69.</w:t>
+        <w:t>Le calendrier part du pilote de la Semaine de l'Indépendance An 68. La plateforme complète est construite et déployée dans le mois qui suit, du 3 octobre au 2 novembre 2026, ce que permettent le socle existant, une architecture sans serveur et une équipe déjà en place. Les onze mois suivants servent à installer l'usage dans les institutions, jusqu'à la première Cérémonie nationale du Mérite lors de la Semaine de l'Indépendance An 69.</w:t>
       </w:r>
     </w:p>
     <w:tbl>
@@ -4574,7 +4636,7 @@
                 <w:color w:val="2A6396"/>
                 <w:sz w:val="18"/>
               </w:rPr>
-              <w:t>1 · Décision et cadrage</w:t>
+              <w:t>1 · Décision</w:t>
             </w:r>
           </w:p>
         </w:tc>
@@ -4596,7 +4658,7 @@
                 <w:color w:val="121826"/>
                 <w:sz w:val="18"/>
               </w:rPr>
-              <w:t>Octobre 2026</w:t>
+              <w:t>Avant le 2 oct. 2026</w:t>
             </w:r>
           </w:p>
         </w:tc>
@@ -4618,7 +4680,7 @@
                 <w:color w:val="121826"/>
                 <w:sz w:val="18"/>
               </w:rPr>
-              <w:t>Approbation, désignation du SGG, nomination des points focaux, cahier des charges, sélection du prestataire</w:t>
+              <w:t>Approbation du projet et du budget, désignation du SGG, nomination des points focaux</w:t>
             </w:r>
           </w:p>
         </w:tc>
@@ -4640,7 +4702,7 @@
                 <w:color w:val="121826"/>
                 <w:sz w:val="18"/>
               </w:rPr>
-              <w:t>Arrêté de création du comité de pilotage ; cahier des charges</w:t>
+              <w:t>Décision du Gouvernement ; arrêté de création du comité de pilotage</w:t>
             </w:r>
           </w:p>
         </w:tc>
@@ -4663,7 +4725,7 @@
                 <w:color w:val="2A6396"/>
                 <w:sz w:val="18"/>
               </w:rPr>
-              <w:t>2 · Construction</w:t>
+              <w:t>2 · Construction et déploiement</w:t>
             </w:r>
           </w:p>
         </w:tc>
@@ -4684,7 +4746,7 @@
                 <w:color w:val="121826"/>
                 <w:sz w:val="18"/>
               </w:rPr>
-              <w:t>Nov. 2026 – janv. 2027</w:t>
+              <w:t>3 oct. – 2 nov. 2026 (un mois)</w:t>
             </w:r>
           </w:p>
         </w:tc>
@@ -4705,7 +4767,7 @@
                 <w:color w:val="121826"/>
                 <w:sz w:val="18"/>
               </w:rPr>
-              <w:t>Portail des institutions, comptes, tableau de bord, module Mérite, audit de sécurité ; trois ministères pilotes préparent leurs quiz</w:t>
+              <w:t>Semaine 1 : portail des institutions et générateur de quiz · Semaine 2 : comptes participants, classements, certificats · Semaine 3 : tableau de bord, module Mérite, audit de sécurité · Semaine 4 : recette, formation des points focaux, mise en service ; trois ministères pilotes préparent leurs quiz en parallèle</w:t>
             </w:r>
           </w:p>
         </w:tc>
@@ -4726,7 +4788,7 @@
                 <w:color w:val="121826"/>
                 <w:sz w:val="18"/>
               </w:rPr>
-              <w:t>Plateforme recettée ; trois campagnes prêtes</w:t>
+              <w:t>Plateforme en service le 2 novembre 2026 ; trois campagnes prêtes</w:t>
             </w:r>
           </w:p>
         </w:tc>
@@ -4772,7 +4834,7 @@
                 <w:color w:val="121826"/>
                 <w:sz w:val="18"/>
               </w:rPr>
-              <w:t>Février 2027</w:t>
+              <w:t>Novembre 2026</w:t>
             </w:r>
           </w:p>
         </w:tc>
@@ -4794,7 +4856,7 @@
                 <w:color w:val="121826"/>
                 <w:sz w:val="18"/>
               </w:rPr>
-              <w:t>Lancement avec cinq à huit institutions ; première campagne nationale « Guinée, mon pays » ; premières récompenses</w:t>
+              <w:t>Lancement avec cinq à huit institutions ; première campagne nationale « Guinée, mon pays » ; premières récompenses avant la fin de l'année</w:t>
             </w:r>
           </w:p>
         </w:tc>
@@ -4816,7 +4878,7 @@
                 <w:color w:val="121826"/>
                 <w:sz w:val="18"/>
               </w:rPr>
-              <w:t>Plateforme en service ; premiers lauréats</w:t>
+              <w:t>Premiers lauréats</w:t>
             </w:r>
           </w:p>
         </w:tc>
@@ -4860,7 +4922,7 @@
                 <w:color w:val="121826"/>
                 <w:sz w:val="18"/>
               </w:rPr>
-              <w:t>Mars – sept. 2027</w:t>
+              <w:t>Déc. 2026 – sept. 2027</w:t>
             </w:r>
           </w:p>
         </w:tc>
@@ -4881,7 +4943,7 @@
                 <w:color w:val="121826"/>
                 <w:sz w:val="18"/>
               </w:rPr>
-              <w:t>Quinze institutions et plus, campagnes mensuelles, finales régionales, langues nationales, préparation du canal SMS</w:t>
+              <w:t>Quinze institutions et plus, campagnes mensuelles, finales régionales, langues nationales, canal SMS</w:t>
             </w:r>
           </w:p>
         </w:tc>
@@ -5020,7 +5082,7 @@
           <w:color w:val="2A6396"/>
           <w:sz w:val="25"/>
         </w:rPr>
-        <w:t>12. BUDGET : 370 000 000 GNF POUR LA CONSTRUCTION ET DOUZE MOIS D'EXPLOITATION</w:t>
+        <w:t>12. BUDGET : 400 000 000 GNF POUR LA CONSTRUCTION ET DOUZE MOIS D'EXPLOITATION</w:t>
       </w:r>
     </w:p>
     <w:p>
@@ -5207,7 +5269,7 @@
                 <w:color w:val="121826"/>
                 <w:sz w:val="19"/>
               </w:rPr>
-              <w:t>150 000 000</w:t>
+              <w:t>165 000 000</w:t>
             </w:r>
           </w:p>
         </w:tc>
@@ -5290,7 +5352,7 @@
                 <w:color w:val="121826"/>
                 <w:sz w:val="19"/>
               </w:rPr>
-              <w:t>60 000 000</w:t>
+              <w:t>65 000 000</w:t>
             </w:r>
           </w:p>
         </w:tc>
@@ -5456,7 +5518,7 @@
                 <w:color w:val="121826"/>
                 <w:sz w:val="19"/>
               </w:rPr>
-              <w:t>80 000 000</w:t>
+              <w:t>85 000 000</w:t>
             </w:r>
           </w:p>
         </w:tc>
@@ -5622,7 +5684,7 @@
                 <w:color w:val="121826"/>
                 <w:sz w:val="19"/>
               </w:rPr>
-              <w:t>20 000 000</w:t>
+              <w:t>25 000 000</w:t>
             </w:r>
           </w:p>
         </w:tc>
@@ -5763,7 +5825,7 @@
                 <w:color w:val="121826"/>
                 <w:sz w:val="22"/>
               </w:rPr>
-              <w:t>370 000 000</w:t>
+              <w:t>400 000 000</w:t>
             </w:r>
           </w:p>
         </w:tc>
@@ -5788,7 +5850,7 @@
           <w:color w:val="121826"/>
           <w:sz w:val="20"/>
         </w:rPr>
-        <w:t>Total : 370 000 000 GNF, soit environ 42 100 USD au taux de 8 780 GNF pour un dollar (septembre 2026). Les récompenses (bourses, places de formation, stages, emplois) sont des contributions en nature des institutions et des partenaires, hors budget de la plateforme, réunies dans le Fonds du Mérite. Le budget de l'année 2 se limitera à l'exploitation et aux évolutions (canal SMS, langues nationales), estimé à moins de la moitié du budget de l'année 1.</w:t>
+        <w:t>Total : 400 000 000 GNF, soit environ 45 600 USD au taux de 8 780 GNF pour un dollar (septembre 2026). Les récompenses (bourses, places de formation, stages, emplois) sont des contributions en nature des institutions et des partenaires, hors budget de la plateforme, réunies dans le Fonds du Mérite. Le budget de l'année 2 se limitera à l'exploitation et aux évolutions (canal SMS, langues nationales), estimé à moins de la moitié du budget de l'année 1.</w:t>
       </w:r>
     </w:p>
     <w:p>
@@ -6270,7 +6332,7 @@
           <w:color w:val="121826"/>
           <w:sz w:val="21"/>
         </w:rPr>
-        <w:t>Autoriser un budget de 370 000 000 GNF pour la construction de la plateforme et douze mois d'exploitation, jusqu'à un million d'utilisateurs par mois.</w:t>
+        <w:t>Autoriser un budget de 400 000 000 GNF pour la construction de la plateforme et douze mois d'exploitation, jusqu'à un million d'utilisateurs par mois, avec une mise en service dans le mois qui suit la Semaine de l'Indépendance.</w:t>
       </w:r>
     </w:p>
     <w:p>
@@ -6298,7 +6360,7 @@
           <w:color w:val="121826"/>
           <w:sz w:val="21"/>
         </w:rPr>
-        <w:t>Instruire chaque ministère, agence et société d'État de désigner un point focal dans les trente jours et de publier au moins un quiz au cours de la première année.</w:t>
+        <w:t>Instruire chaque ministère, agence et société d'État de désigner un point focal dans les quinze jours et de publier au moins un quiz au cours de la première année.</w:t>
       </w:r>
     </w:p>
     <w:p>

</xml_diff>